<commit_message>
Session 2 flow: breather between the two ambushes (F3); companion staging (D1)
F3: added a calm beat (the party back on dry ground, Stabby scraping off mud) between the Mudskip and Grimfang fights so the second ambush lands fresh. D1: the Session 3 teaser said the creatures wait 'in three baskets,' but the played S3 scene has them roaming Aelwyn's laboratory; reworded to match.

Co-Authored-By: Claude Opus 4.8 <noreply@anthropic.com>
</commit_message>
<xml_diff>
--- a/sessions/session_02_oakshade_village.docx
+++ b/sessions/session_02_oakshade_village.docx
@@ -1460,6 +1460,26 @@
           <w:sz w:val="19"/>
         </w:rPr>
         <w:t xml:space="preserve"> for the professor.</w:t>
+      </w:r>
+    </w:p>
+    <w:p>
+      <w:pPr>
+        <w:pBdr>
+          <w:left w:val="single" w:sz="18" w:space="12" w:color="B8860B"/>
+        </w:pBdr>
+        <w:shd w:val="clear" w:color="auto" w:fill="FBF6EA"/>
+        <w:spacing w:before="30" w:after="70"/>
+        <w:ind w:left="340" w:right="340"/>
+      </w:pPr>
+      <w:r>
+        <w:rPr>
+          <w:rFonts w:ascii="Georgia" w:hAnsi="Georgia" w:cs="Georgia"/>
+          <w:b w:val="0"/>
+          <w:i w:val="0"/>
+          <w:color w:val="222222"/>
+          <w:sz w:val="21"/>
+        </w:rPr>
+        <w:t>For a mile or two the road is kind. The party hauls itself back onto dry ground, Stabby scraping mud from his ears and loudly declaring the marsh his sworn enemy, and there is a little while of easy walking and easier laughter, the warm quiet of friends who have just won something together.</w:t>
       </w:r>
     </w:p>
     <w:p>
@@ -3918,7 +3938,7 @@
           <w:color w:val="222222"/>
           <w:sz w:val="21"/>
         </w:rPr>
-        <w:t>Next: Session 3, in which the professor examines the Essence Sphere, three small creatures wait in three baskets, and a dark figure watches from the top of Stormwatch Cliffs.</w:t>
+        <w:t>Next: Session 3, in which the professor examines the Essence Sphere, three small creatures roam his laboratory, and a dark figure watches from the top of Stormwatch Cliffs.</w:t>
       </w:r>
     </w:p>
     <w:p>

</xml_diff>